<commit_message>
docs: update the guides for the new reminder timing and reception agenda
The reminder chapter still described a fixed 24h notice. It now explains the quiet hours,
which is what a clinic actually needs to predict when its patients hear from us: morning
appointments are reminded at 21:00 the evening before, the rest at 08:00 on the day, and
appointments starting before 9 get a single reminder rather than one at dawn.

Reception gained access to the shared clinic agenda today, so the reception guide gets a
chapter of its own and the administrator guide no longer claims only practitioners see it.

The docx builder had no handler for image blocks, so it crashed the moment screenshots were
added and the .docx on the site quietly stayed at their pre-screenshot state. Both formats
build from the same content again.

Co-Authored-By: Claude Opus 5 <noreply@anthropic.com>
</commit_message>
<xml_diff>
--- a/public/docs/Ghid_Administrator_Clinica.docx
+++ b/public/docs/Ghid_Administrator_Clinica.docx
@@ -51,7 +51,7 @@
           <w:color w:val="64748B"/>
           <w:sz w:val="20"/>
         </w:rPr>
-        <w:t>mediciro.ro  ·  contact@mediciro.ro  ·  iulie 2026</w:t>
+        <w:t>mediciro.ro  ·  contact@mediciro.ro  ·  august 2026</w:t>
       </w:r>
     </w:p>
     <w:p>
@@ -91,6 +91,58 @@
           <w:sz w:val="34"/>
         </w:rPr>
         <w:t>Ce poți face ca administrator de clinică</w:t>
+      </w:r>
+    </w:p>
+    <w:p>
+      <w:pPr>
+        <w:jc w:val="center"/>
+      </w:pPr>
+      <w:r>
+        <w:drawing>
+          <wp:inline xmlns:a="http://schemas.openxmlformats.org/drawingml/2006/main" xmlns:pic="http://schemas.openxmlformats.org/drawingml/2006/picture">
+            <wp:extent cx="5580000" cy="3487500"/>
+            <wp:docPr id="1" name="Picture 1"/>
+            <wp:cNvGraphicFramePr>
+              <a:graphicFrameLocks noChangeAspect="1"/>
+            </wp:cNvGraphicFramePr>
+            <a:graphic>
+              <a:graphicData uri="http://schemas.openxmlformats.org/drawingml/2006/picture">
+                <pic:pic>
+                  <pic:nvPicPr>
+                    <pic:cNvPr id="0" name="01-dashboard.png"/>
+                    <pic:cNvPicPr/>
+                  </pic:nvPicPr>
+                  <pic:blipFill>
+                    <a:blip r:embed="rId9"/>
+                    <a:stretch>
+                      <a:fillRect/>
+                    </a:stretch>
+                  </pic:blipFill>
+                  <pic:spPr>
+                    <a:xfrm>
+                      <a:off x="0" y="0"/>
+                      <a:ext cx="5580000" cy="3487500"/>
+                    </a:xfrm>
+                    <a:prstGeom prst="rect"/>
+                  </pic:spPr>
+                </pic:pic>
+              </a:graphicData>
+            </a:graphic>
+          </wp:inline>
+        </w:drawing>
+      </w:r>
+    </w:p>
+    <w:p>
+      <w:pPr>
+        <w:jc w:val="center"/>
+      </w:pPr>
+      <w:r>
+        <w:rPr>
+          <w:i/>
+          <w:color w:val="64748B"/>
+          <w:sz w:val="17"/>
+        </w:rPr>
+        <w:t>Tabloul de bord al clinicii</w:t>
       </w:r>
     </w:p>
     <w:p>
@@ -447,6 +499,58 @@
     </w:p>
     <w:p>
       <w:pPr>
+        <w:jc w:val="center"/>
+      </w:pPr>
+      <w:r>
+        <w:drawing>
+          <wp:inline xmlns:a="http://schemas.openxmlformats.org/drawingml/2006/main" xmlns:pic="http://schemas.openxmlformats.org/drawingml/2006/picture">
+            <wp:extent cx="5580000" cy="3487500"/>
+            <wp:docPr id="2" name="Picture 2"/>
+            <wp:cNvGraphicFramePr>
+              <a:graphicFrameLocks noChangeAspect="1"/>
+            </wp:cNvGraphicFramePr>
+            <a:graphic>
+              <a:graphicData uri="http://schemas.openxmlformats.org/drawingml/2006/picture">
+                <pic:pic>
+                  <pic:nvPicPr>
+                    <pic:cNvPr id="0" name="02-doctori.png"/>
+                    <pic:cNvPicPr/>
+                  </pic:nvPicPr>
+                  <pic:blipFill>
+                    <a:blip r:embed="rId10"/>
+                    <a:stretch>
+                      <a:fillRect/>
+                    </a:stretch>
+                  </pic:blipFill>
+                  <pic:spPr>
+                    <a:xfrm>
+                      <a:off x="0" y="0"/>
+                      <a:ext cx="5580000" cy="3487500"/>
+                    </a:xfrm>
+                    <a:prstGeom prst="rect"/>
+                  </pic:spPr>
+                </pic:pic>
+              </a:graphicData>
+            </a:graphic>
+          </wp:inline>
+        </w:drawing>
+      </w:r>
+    </w:p>
+    <w:p>
+      <w:pPr>
+        <w:jc w:val="center"/>
+      </w:pPr>
+      <w:r>
+        <w:rPr>
+          <w:i/>
+          <w:color w:val="64748B"/>
+          <w:sz w:val="17"/>
+        </w:rPr>
+        <w:t>Lista medicilor clinicii</w:t>
+      </w:r>
+    </w:p>
+    <w:p>
+      <w:pPr>
         <w:pStyle w:val="ListNumber"/>
       </w:pPr>
       <w:r>
@@ -613,6 +717,58 @@
       </w:r>
     </w:p>
     <w:p>
+      <w:pPr>
+        <w:jc w:val="center"/>
+      </w:pPr>
+      <w:r>
+        <w:drawing>
+          <wp:inline xmlns:a="http://schemas.openxmlformats.org/drawingml/2006/main" xmlns:pic="http://schemas.openxmlformats.org/drawingml/2006/picture">
+            <wp:extent cx="5580000" cy="2790000"/>
+            <wp:docPr id="3" name="Picture 3"/>
+            <wp:cNvGraphicFramePr>
+              <a:graphicFrameLocks noChangeAspect="1"/>
+            </wp:cNvGraphicFramePr>
+            <a:graphic>
+              <a:graphicData uri="http://schemas.openxmlformats.org/drawingml/2006/picture">
+                <pic:pic>
+                  <pic:nvPicPr>
+                    <pic:cNvPr id="0" name="03-lista-programari.png"/>
+                    <pic:cNvPicPr/>
+                  </pic:nvPicPr>
+                  <pic:blipFill>
+                    <a:blip r:embed="rId11"/>
+                    <a:stretch>
+                      <a:fillRect/>
+                    </a:stretch>
+                  </pic:blipFill>
+                  <pic:spPr>
+                    <a:xfrm>
+                      <a:off x="0" y="0"/>
+                      <a:ext cx="5580000" cy="2790000"/>
+                    </a:xfrm>
+                    <a:prstGeom prst="rect"/>
+                  </pic:spPr>
+                </pic:pic>
+              </a:graphicData>
+            </a:graphic>
+          </wp:inline>
+        </w:drawing>
+      </w:r>
+    </w:p>
+    <w:p>
+      <w:pPr>
+        <w:jc w:val="center"/>
+      </w:pPr>
+      <w:r>
+        <w:rPr>
+          <w:i/>
+          <w:color w:val="64748B"/>
+          <w:sz w:val="17"/>
+        </w:rPr>
+        <w:t>Programările clinicii, cu filtre</w:t>
+      </w:r>
+    </w:p>
+    <w:p>
       <w:r>
         <w:rPr>
           <w:sz w:val="22"/>
@@ -630,6 +786,58 @@
           <w:sz w:val="26"/>
         </w:rPr>
         <w:t>Calendar și programări manuale</w:t>
+      </w:r>
+    </w:p>
+    <w:p>
+      <w:pPr>
+        <w:jc w:val="center"/>
+      </w:pPr>
+      <w:r>
+        <w:drawing>
+          <wp:inline xmlns:a="http://schemas.openxmlformats.org/drawingml/2006/main" xmlns:pic="http://schemas.openxmlformats.org/drawingml/2006/picture">
+            <wp:extent cx="5580000" cy="2790000"/>
+            <wp:docPr id="4" name="Picture 4"/>
+            <wp:cNvGraphicFramePr>
+              <a:graphicFrameLocks noChangeAspect="1"/>
+            </wp:cNvGraphicFramePr>
+            <a:graphic>
+              <a:graphicData uri="http://schemas.openxmlformats.org/drawingml/2006/picture">
+                <pic:pic>
+                  <pic:nvPicPr>
+                    <pic:cNvPr id="0" name="04-calendar.png"/>
+                    <pic:cNvPicPr/>
+                  </pic:nvPicPr>
+                  <pic:blipFill>
+                    <a:blip r:embed="rId12"/>
+                    <a:stretch>
+                      <a:fillRect/>
+                    </a:stretch>
+                  </pic:blipFill>
+                  <pic:spPr>
+                    <a:xfrm>
+                      <a:off x="0" y="0"/>
+                      <a:ext cx="5580000" cy="2790000"/>
+                    </a:xfrm>
+                    <a:prstGeom prst="rect"/>
+                  </pic:spPr>
+                </pic:pic>
+              </a:graphicData>
+            </a:graphic>
+          </wp:inline>
+        </w:drawing>
+      </w:r>
+    </w:p>
+    <w:p>
+      <w:pPr>
+        <w:jc w:val="center"/>
+      </w:pPr>
+      <w:r>
+        <w:rPr>
+          <w:i/>
+          <w:color w:val="64748B"/>
+          <w:sz w:val="17"/>
+        </w:rPr>
+        <w:t>Calendarul, pentru programări manuale</w:t>
       </w:r>
     </w:p>
     <w:p>
@@ -756,11 +964,63 @@
       </w:r>
     </w:p>
     <w:p>
+      <w:pPr>
+        <w:jc w:val="center"/>
+      </w:pPr>
+      <w:r>
+        <w:drawing>
+          <wp:inline xmlns:a="http://schemas.openxmlformats.org/drawingml/2006/main" xmlns:pic="http://schemas.openxmlformats.org/drawingml/2006/picture">
+            <wp:extent cx="5580000" cy="2625882"/>
+            <wp:docPr id="5" name="Picture 5"/>
+            <wp:cNvGraphicFramePr>
+              <a:graphicFrameLocks noChangeAspect="1"/>
+            </wp:cNvGraphicFramePr>
+            <a:graphic>
+              <a:graphicData uri="http://schemas.openxmlformats.org/drawingml/2006/picture">
+                <pic:pic>
+                  <pic:nvPicPr>
+                    <pic:cNvPr id="0" name="05-agenda-clinicii.png"/>
+                    <pic:cNvPicPr/>
+                  </pic:nvPicPr>
+                  <pic:blipFill>
+                    <a:blip r:embed="rId13"/>
+                    <a:stretch>
+                      <a:fillRect/>
+                    </a:stretch>
+                  </pic:blipFill>
+                  <pic:spPr>
+                    <a:xfrm>
+                      <a:off x="0" y="0"/>
+                      <a:ext cx="5580000" cy="2625882"/>
+                    </a:xfrm>
+                    <a:prstGeom prst="rect"/>
+                  </pic:spPr>
+                </pic:pic>
+              </a:graphicData>
+            </a:graphic>
+          </wp:inline>
+        </w:drawing>
+      </w:r>
+    </w:p>
+    <w:p>
+      <w:pPr>
+        <w:jc w:val="center"/>
+      </w:pPr>
+      <w:r>
+        <w:rPr>
+          <w:i/>
+          <w:color w:val="64748B"/>
+          <w:sz w:val="17"/>
+        </w:rPr>
+        <w:t>Agenda: disponibilitatea colegilor pe o săptămână</w:t>
+      </w:r>
+    </w:p>
+    <w:p>
       <w:r>
         <w:rPr>
           <w:sz w:val="22"/>
         </w:rPr>
-        <w:t>Agenda arată, într-un singur tabel, disponibilitatea tuturor medicilor pe o săptămână. Un medic poate astfel îndruma pacientul către cel mai apropiat coleg liber și poate programa direct în orarul acestuia.</w:t>
+        <w:t>Agenda arată, într-un singur tabel, disponibilitatea tuturor medicilor pe o săptămână. Un medic poate astfel îndruma pacientul către cel mai apropiat coleg liber și poate programa direct în orarul acestuia. O văd atât medicii, cât și recepția.</w:t>
       </w:r>
     </w:p>
     <w:p>
@@ -779,7 +1039,7 @@
         <w:rPr>
           <w:sz w:val="22"/>
         </w:rPr>
-        <w:t>Activarea agendei — medicii văd intervalele libere și ocupate ale colegilor.</w:t>
+        <w:t>Activarea agendei — medicii și recepția văd intervalele libere și ocupate ale medicilor.</w:t>
       </w:r>
     </w:p>
     <w:p>
@@ -823,6 +1083,58 @@
           <w:sz w:val="34"/>
         </w:rPr>
         <w:t>Centre de tratament</w:t>
+      </w:r>
+    </w:p>
+    <w:p>
+      <w:pPr>
+        <w:jc w:val="center"/>
+      </w:pPr>
+      <w:r>
+        <w:drawing>
+          <wp:inline xmlns:a="http://schemas.openxmlformats.org/drawingml/2006/main" xmlns:pic="http://schemas.openxmlformats.org/drawingml/2006/picture">
+            <wp:extent cx="5580000" cy="3487500"/>
+            <wp:docPr id="6" name="Picture 6"/>
+            <wp:cNvGraphicFramePr>
+              <a:graphicFrameLocks noChangeAspect="1"/>
+            </wp:cNvGraphicFramePr>
+            <a:graphic>
+              <a:graphicData uri="http://schemas.openxmlformats.org/drawingml/2006/picture">
+                <pic:pic>
+                  <pic:nvPicPr>
+                    <pic:cNvPr id="0" name="06-centre-tratament.png"/>
+                    <pic:cNvPicPr/>
+                  </pic:nvPicPr>
+                  <pic:blipFill>
+                    <a:blip r:embed="rId14"/>
+                    <a:stretch>
+                      <a:fillRect/>
+                    </a:stretch>
+                  </pic:blipFill>
+                  <pic:spPr>
+                    <a:xfrm>
+                      <a:off x="0" y="0"/>
+                      <a:ext cx="5580000" cy="3487500"/>
+                    </a:xfrm>
+                    <a:prstGeom prst="rect"/>
+                  </pic:spPr>
+                </pic:pic>
+              </a:graphicData>
+            </a:graphic>
+          </wp:inline>
+        </w:drawing>
+      </w:r>
+    </w:p>
+    <w:p>
+      <w:pPr>
+        <w:jc w:val="center"/>
+      </w:pPr>
+      <w:r>
+        <w:rPr>
+          <w:i/>
+          <w:color w:val="64748B"/>
+          <w:sz w:val="17"/>
+        </w:rPr>
+        <w:t>Centrele de tratament și asistenții lor</w:t>
       </w:r>
     </w:p>
     <w:p>
@@ -940,7 +1252,7 @@
         <w:rPr>
           <w:sz w:val="22"/>
         </w:rPr>
-        <w:t>Remindere: poți activa separat mesajul cu 24 de ore înainte și pe cel cu 2 ore înainte.</w:t>
+        <w:t>Remindere: poți activa separat mesajul timpuriu (cu aproximativ 12 ore înainte) și pe cel cu 2 ore înainte. Nu trimitem notificări noaptea: programările de dimineață primesc reminderul seara precedentă, la ora 21:00, iar restul la ora 8:00 în ziua programării. Programările care încep înainte de ora 9 primesc un singur reminder.</w:t>
       </w:r>
     </w:p>
     <w:p>
@@ -973,6 +1285,58 @@
           <w:sz w:val="34"/>
         </w:rPr>
         <w:t>Abonament și facturare</w:t>
+      </w:r>
+    </w:p>
+    <w:p>
+      <w:pPr>
+        <w:jc w:val="center"/>
+      </w:pPr>
+      <w:r>
+        <w:drawing>
+          <wp:inline xmlns:a="http://schemas.openxmlformats.org/drawingml/2006/main" xmlns:pic="http://schemas.openxmlformats.org/drawingml/2006/picture">
+            <wp:extent cx="5580000" cy="3487500"/>
+            <wp:docPr id="7" name="Picture 7"/>
+            <wp:cNvGraphicFramePr>
+              <a:graphicFrameLocks noChangeAspect="1"/>
+            </wp:cNvGraphicFramePr>
+            <a:graphic>
+              <a:graphicData uri="http://schemas.openxmlformats.org/drawingml/2006/picture">
+                <pic:pic>
+                  <pic:nvPicPr>
+                    <pic:cNvPr id="0" name="10-facturare.png"/>
+                    <pic:cNvPicPr/>
+                  </pic:nvPicPr>
+                  <pic:blipFill>
+                    <a:blip r:embed="rId15"/>
+                    <a:stretch>
+                      <a:fillRect/>
+                    </a:stretch>
+                  </pic:blipFill>
+                  <pic:spPr>
+                    <a:xfrm>
+                      <a:off x="0" y="0"/>
+                      <a:ext cx="5580000" cy="3487500"/>
+                    </a:xfrm>
+                    <a:prstGeom prst="rect"/>
+                  </pic:spPr>
+                </pic:pic>
+              </a:graphicData>
+            </a:graphic>
+          </wp:inline>
+        </w:drawing>
+      </w:r>
+    </w:p>
+    <w:p>
+      <w:pPr>
+        <w:jc w:val="center"/>
+      </w:pPr>
+      <w:r>
+        <w:rPr>
+          <w:i/>
+          <w:color w:val="64748B"/>
+          <w:sz w:val="17"/>
+        </w:rPr>
+        <w:t>Planul curent și funcționalitățile incluse</w:t>
       </w:r>
     </w:p>
     <w:p>

</xml_diff>